<commit_message>
Agregar seccion de recursos (repo y dashboard) en Entregable 2
Incluye los enlaces al repositorio de GitHub y al dashboard de Streamlit
en el notebook (celda destacada) y en el documento Word (seccion antes
de Referencias, con hipervinculos), para la entrega y la exposicion.

Co-Authored-By: Claude Opus 4.7 (1M context) <noreply@anthropic.com>
</commit_message>
<xml_diff>
--- a/Entregable2/Entregable2_Documento_APA.docx
+++ b/Entregable2/Entregable2_Documento_APA.docx
@@ -2379,6 +2379,84 @@
     </w:p>
     <w:p>
       <w:pPr>
+        <w:jc w:val="left"/>
+      </w:pPr>
+      <w:r>
+        <w:rPr>
+          <w:rFonts w:ascii="Times New Roman" w:hAnsi="Times New Roman" w:eastAsia="Times New Roman"/>
+          <w:b/>
+          <w:i w:val="0"/>
+          <w:sz w:val="26"/>
+        </w:rPr>
+        <w:t>Recursos del Proyecto</w:t>
+      </w:r>
+    </w:p>
+    <w:p>
+      <w:pPr>
+        <w:jc w:val="both"/>
+      </w:pPr>
+      <w:r>
+        <w:rPr>
+          <w:rFonts w:ascii="Times New Roman" w:hAnsi="Times New Roman" w:eastAsia="Times New Roman"/>
+          <w:b w:val="0"/>
+          <w:i w:val="0"/>
+          <w:sz w:val="24"/>
+        </w:rPr>
+        <w:t>El código fuente completo (notebooks de ambos entregables y el dashboard), la documentación y las instrucciones de reproducción se encuentran en el repositorio público de GitHub. Adicionalmente, como valor agregado, se desarrolló un dashboard interactivo desplegado en Streamlit Community Cloud que permite explorar el análisis y realizar predicciones en línea sin instalar nada.</w:t>
+      </w:r>
+    </w:p>
+    <w:p>
+      <w:pPr>
+        <w:jc w:val="left"/>
+      </w:pPr>
+      <w:r>
+        <w:rPr>
+          <w:rFonts w:ascii="Times New Roman" w:hAnsi="Times New Roman" w:eastAsia="Times New Roman"/>
+          <w:b/>
+          <w:i w:val="0"/>
+          <w:sz w:val="24"/>
+        </w:rPr>
+        <w:t xml:space="preserve">Repositorio (GitHub): </w:t>
+      </w:r>
+      <w:hyperlink r:id="rId17">
+        <w:r>
+          <w:rPr>
+            <w:rFonts w:ascii="Times New Roman" w:hAnsi="Times New Roman"/>
+            <w:sz w:val="24"/>
+            <w:color w:val="0563C1"/>
+            <w:u w:val="single"/>
+          </w:rPr>
+          <w:t xml:space="preserve">https://github.com/JAAM010/seminario-datos-heart-disease</w:t>
+        </w:r>
+      </w:hyperlink>
+    </w:p>
+    <w:p>
+      <w:pPr>
+        <w:jc w:val="left"/>
+      </w:pPr>
+      <w:r>
+        <w:rPr>
+          <w:rFonts w:ascii="Times New Roman" w:hAnsi="Times New Roman" w:eastAsia="Times New Roman"/>
+          <w:b/>
+          <w:i w:val="0"/>
+          <w:sz w:val="24"/>
+        </w:rPr>
+        <w:t xml:space="preserve">Dashboard interactivo (Streamlit): </w:t>
+      </w:r>
+      <w:hyperlink r:id="rId18">
+        <w:r>
+          <w:rPr>
+            <w:rFonts w:ascii="Times New Roman" w:hAnsi="Times New Roman"/>
+            <w:sz w:val="24"/>
+            <w:color w:val="0563C1"/>
+            <w:u w:val="single"/>
+          </w:rPr>
+          <w:t xml:space="preserve">https://heart-disease-jaam010.streamlit.app</w:t>
+        </w:r>
+      </w:hyperlink>
+    </w:p>
+    <w:p>
+      <w:pPr>
         <w:spacing w:before="120" w:after="120"/>
         <w:ind w:firstLine="0"/>
         <w:jc w:val="center"/>

</xml_diff>